<commit_message>
feat(mngdocument,mng.ui): Odak G0-G5 generation runtime and XLSX shipment list
Add RuntimeEnvelope generate/run, producer and dataSource catalogs, DOCX table expansion for Activity, and XLSX shipment list with Odak Siparis UI. Fix DataSourceTokenResolver JsonElement resolution and document checkpoint roadmaps.

Co-authored-by: Cursor <cursoragent@cursor.com>
</commit_message>
<xml_diff>
--- a/docs/odak/document_intelligence/sample/ODK-LINE-ACTIVITY-template-seed.docx
+++ b/docs/odak/document_intelligence/sample/ODK-LINE-ACTIVITY-template-seed.docx
@@ -1681,6 +1681,318 @@
                 <w:szCs w:val="20"/>
               </w:rPr>
               <w:t xml:space="preserve">{{shipmentAddress}}</w:t>
+            </w:r>
+          </w:p>
+        </w:tc>
+      </w:tr>
+    </w:tbl>
+    <w:p>
+      <w:pPr>
+        <w:jc w:val="left"/>
+        <w:spacing w:before="0" w:after="160" w:line="240" w:lineRule="auto"/>
+      </w:pPr>
+    </w:p>
+    <w:tbl>
+      <w:tblPr>
+        <w:tblW w:w="5000" w:type="pct"/>
+        <w:tblBorders>
+          <w:top w:val="nil"/>
+          <w:left w:val="nil"/>
+          <w:bottom w:val="nil"/>
+          <w:right w:val="nil"/>
+          <w:insideH w:val="nil"/>
+          <w:insideV w:val="nil"/>
+        </w:tblBorders>
+        <w:tblCellMar>
+          <w:top w:w="0" w:type="dxa"/>
+          <w:left w:w="0" w:type="dxa"/>
+          <w:bottom w:w="0" w:type="dxa"/>
+          <w:right w:w="0" w:type="dxa"/>
+        </w:tblCellMar>
+      </w:tblPr>
+      <w:tblGrid>
+        <w:gridCol w:w="113"/>
+        <w:gridCol w:w="8913"/>
+      </w:tblGrid>
+      <w:tr>
+        <w:tc>
+          <w:tcPr>
+            <w:tcW w:w="113" w:type="dxa"/>
+            <w:shd w:val="clear" w:color="auto" w:fill="1E3A5F"/>
+          </w:tcPr>
+          <w:p>
+            <w:pPr>
+              <w:spacing w:before="40" w:after="40"/>
+            </w:pPr>
+          </w:p>
+        </w:tc>
+        <w:tc>
+          <w:tcPr>
+            <w:tcW w:w="8913" w:type="dxa"/>
+            <w:shd w:val="clear" w:color="auto" w:fill="E8EEF4"/>
+          </w:tcPr>
+          <w:p>
+            <w:pPr>
+              <w:spacing w:before="60" w:after="60"/>
+            </w:pPr>
+            <w:r>
+              <w:rPr>
+                <w:rFonts w:ascii="Calibri" w:hAnsi="Calibri" w:cs="Calibri"/>
+                <w:b/>
+                <w:color w:val="1E3A5F"/>
+                <w:sz w:val="22"/>
+                <w:szCs w:val="22"/>
+              </w:rPr>
+              <w:t xml:space="preserve">Sevkiyat satırları</w:t>
+            </w:r>
+          </w:p>
+        </w:tc>
+      </w:tr>
+    </w:tbl>
+    <w:p>
+      <w:pPr>
+        <w:jc w:val="left"/>
+        <w:spacing w:before="0" w:after="80" w:line="240" w:lineRule="auto"/>
+      </w:pPr>
+    </w:p>
+    <w:tbl>
+      <w:tblPr>
+        <w:tblW w:w="5000" w:type="pct"/>
+        <w:tblBorders>
+          <w:top w:val="single" w:sz="4" w:space="0" w:color="D0D7DE"/>
+          <w:left w:val="single" w:sz="4" w:space="0" w:color="D0D7DE"/>
+          <w:bottom w:val="single" w:sz="4" w:space="0" w:color="D0D7DE"/>
+          <w:right w:val="single" w:sz="4" w:space="0" w:color="D0D7DE"/>
+          <w:insideH w:val="single" w:sz="4" w:space="0" w:color="D0D7DE"/>
+          <w:insideV w:val="single" w:sz="4" w:space="0" w:color="D0D7DE"/>
+        </w:tblBorders>
+      </w:tblPr>
+      <w:tblGrid>
+        <w:gridCol w:w="2256"/>
+        <w:gridCol w:w="2256"/>
+        <w:gridCol w:w="2256"/>
+        <w:gridCol w:w="2256"/>
+      </w:tblGrid>
+      <w:tr>
+        <w:tc>
+          <w:tcPr>
+            <w:tcW w:w="2256" w:type="dxa"/>
+            <w:shd w:val="clear" w:color="auto" w:fill="E8EEF4"/>
+            <w:tcMar>
+              <w:top w:w="100" w:type="dxa"/>
+              <w:left w:w="100" w:type="dxa"/>
+              <w:bottom w:w="100" w:type="dxa"/>
+              <w:right w:w="100" w:type="dxa"/>
+            </w:tcMar>
+          </w:tcPr>
+          <w:p>
+            <w:pPr>
+              <w:jc w:val="center"/>
+              <w:spacing w:before="20" w:after="20"/>
+            </w:pPr>
+            <w:r>
+              <w:rPr>
+                <w:rFonts w:ascii="Calibri" w:hAnsi="Calibri" w:cs="Calibri"/>
+                <w:b/>
+                <w:color w:val="1E3A5F"/>
+                <w:sz w:val="18"/>
+                <w:szCs w:val="18"/>
+              </w:rPr>
+              <w:t xml:space="preserve">Kalem No</w:t>
+            </w:r>
+          </w:p>
+        </w:tc>
+        <w:tc>
+          <w:tcPr>
+            <w:tcW w:w="2256" w:type="dxa"/>
+            <w:shd w:val="clear" w:color="auto" w:fill="E8EEF4"/>
+            <w:tcMar>
+              <w:top w:w="100" w:type="dxa"/>
+              <w:left w:w="100" w:type="dxa"/>
+              <w:bottom w:w="100" w:type="dxa"/>
+              <w:right w:w="100" w:type="dxa"/>
+            </w:tcMar>
+          </w:tcPr>
+          <w:p>
+            <w:pPr>
+              <w:jc w:val="center"/>
+              <w:spacing w:before="20" w:after="20"/>
+            </w:pPr>
+            <w:r>
+              <w:rPr>
+                <w:rFonts w:ascii="Calibri" w:hAnsi="Calibri" w:cs="Calibri"/>
+                <w:b/>
+                <w:color w:val="1E3A5F"/>
+                <w:sz w:val="18"/>
+                <w:szCs w:val="18"/>
+              </w:rPr>
+              <w:t xml:space="preserve">Tanım</w:t>
+            </w:r>
+          </w:p>
+        </w:tc>
+        <w:tc>
+          <w:tcPr>
+            <w:tcW w:w="2256" w:type="dxa"/>
+            <w:shd w:val="clear" w:color="auto" w:fill="E8EEF4"/>
+            <w:tcMar>
+              <w:top w:w="100" w:type="dxa"/>
+              <w:left w:w="100" w:type="dxa"/>
+              <w:bottom w:w="100" w:type="dxa"/>
+              <w:right w:w="100" w:type="dxa"/>
+            </w:tcMar>
+          </w:tcPr>
+          <w:p>
+            <w:pPr>
+              <w:jc w:val="center"/>
+              <w:spacing w:before="20" w:after="20"/>
+            </w:pPr>
+            <w:r>
+              <w:rPr>
+                <w:rFonts w:ascii="Calibri" w:hAnsi="Calibri" w:cs="Calibri"/>
+                <w:b/>
+                <w:color w:val="1E3A5F"/>
+                <w:sz w:val="18"/>
+                <w:szCs w:val="18"/>
+              </w:rPr>
+              <w:t xml:space="preserve">Sevk Miktarı</w:t>
+            </w:r>
+          </w:p>
+        </w:tc>
+        <w:tc>
+          <w:tcPr>
+            <w:tcW w:w="2256" w:type="dxa"/>
+            <w:shd w:val="clear" w:color="auto" w:fill="E8EEF4"/>
+            <w:tcMar>
+              <w:top w:w="100" w:type="dxa"/>
+              <w:left w:w="100" w:type="dxa"/>
+              <w:bottom w:w="100" w:type="dxa"/>
+              <w:right w:w="100" w:type="dxa"/>
+            </w:tcMar>
+          </w:tcPr>
+          <w:p>
+            <w:pPr>
+              <w:jc w:val="center"/>
+              <w:spacing w:before="20" w:after="20"/>
+            </w:pPr>
+            <w:r>
+              <w:rPr>
+                <w:rFonts w:ascii="Calibri" w:hAnsi="Calibri" w:cs="Calibri"/>
+                <w:b/>
+                <w:color w:val="1E3A5F"/>
+                <w:sz w:val="18"/>
+                <w:szCs w:val="18"/>
+              </w:rPr>
+              <w:t xml:space="preserve">Mod</w:t>
+            </w:r>
+          </w:p>
+        </w:tc>
+      </w:tr>
+      <w:tr>
+        <w:tc>
+          <w:tcPr>
+            <w:tcW w:w="2256" w:type="dxa"/>
+            <w:shd w:val="clear" w:color="auto" w:fill="FFFFFF"/>
+            <w:tcMar>
+              <w:top w:w="100" w:type="dxa"/>
+              <w:left w:w="100" w:type="dxa"/>
+              <w:bottom w:w="100" w:type="dxa"/>
+              <w:right w:w="100" w:type="dxa"/>
+            </w:tcMar>
+          </w:tcPr>
+          <w:p>
+            <w:pPr>
+              <w:jc w:val="center"/>
+              <w:spacing w:before="20" w:after="20"/>
+            </w:pPr>
+            <w:r>
+              <w:rPr>
+                <w:rFonts w:ascii="Calibri" w:hAnsi="Calibri" w:cs="Calibri"/>
+                <w:color w:val="2F3542"/>
+                <w:sz w:val="20"/>
+                <w:szCs w:val="20"/>
+              </w:rPr>
+              <w:t xml:space="preserve">{{shipmentLines.lineNo}}</w:t>
+            </w:r>
+          </w:p>
+        </w:tc>
+        <w:tc>
+          <w:tcPr>
+            <w:tcW w:w="2256" w:type="dxa"/>
+            <w:shd w:val="clear" w:color="auto" w:fill="FFFFFF"/>
+            <w:tcMar>
+              <w:top w:w="100" w:type="dxa"/>
+              <w:left w:w="100" w:type="dxa"/>
+              <w:bottom w:w="100" w:type="dxa"/>
+              <w:right w:w="100" w:type="dxa"/>
+            </w:tcMar>
+          </w:tcPr>
+          <w:p>
+            <w:pPr>
+              <w:jc w:val="center"/>
+              <w:spacing w:before="20" w:after="20"/>
+            </w:pPr>
+            <w:r>
+              <w:rPr>
+                <w:rFonts w:ascii="Calibri" w:hAnsi="Calibri" w:cs="Calibri"/>
+                <w:color w:val="2F3542"/>
+                <w:sz w:val="20"/>
+                <w:szCs w:val="20"/>
+              </w:rPr>
+              <w:t xml:space="preserve">{{shipmentLines.lineDescription}}</w:t>
+            </w:r>
+          </w:p>
+        </w:tc>
+        <w:tc>
+          <w:tcPr>
+            <w:tcW w:w="2256" w:type="dxa"/>
+            <w:shd w:val="clear" w:color="auto" w:fill="FFFFFF"/>
+            <w:tcMar>
+              <w:top w:w="100" w:type="dxa"/>
+              <w:left w:w="100" w:type="dxa"/>
+              <w:bottom w:w="100" w:type="dxa"/>
+              <w:right w:w="100" w:type="dxa"/>
+            </w:tcMar>
+          </w:tcPr>
+          <w:p>
+            <w:pPr>
+              <w:jc w:val="center"/>
+              <w:spacing w:before="20" w:after="20"/>
+            </w:pPr>
+            <w:r>
+              <w:rPr>
+                <w:rFonts w:ascii="Calibri" w:hAnsi="Calibri" w:cs="Calibri"/>
+                <w:color w:val="2F3542"/>
+                <w:sz w:val="20"/>
+                <w:szCs w:val="20"/>
+              </w:rPr>
+              <w:t xml:space="preserve">{{shipmentLines.shippedQuantity}}</w:t>
+            </w:r>
+          </w:p>
+        </w:tc>
+        <w:tc>
+          <w:tcPr>
+            <w:tcW w:w="2256" w:type="dxa"/>
+            <w:shd w:val="clear" w:color="auto" w:fill="FFFFFF"/>
+            <w:tcMar>
+              <w:top w:w="100" w:type="dxa"/>
+              <w:left w:w="100" w:type="dxa"/>
+              <w:bottom w:w="100" w:type="dxa"/>
+              <w:right w:w="100" w:type="dxa"/>
+            </w:tcMar>
+          </w:tcPr>
+          <w:p>
+            <w:pPr>
+              <w:jc w:val="center"/>
+              <w:spacing w:before="20" w:after="20"/>
+            </w:pPr>
+            <w:r>
+              <w:rPr>
+                <w:rFonts w:ascii="Calibri" w:hAnsi="Calibri" w:cs="Calibri"/>
+                <w:color w:val="2F3542"/>
+                <w:sz w:val="20"/>
+                <w:szCs w:val="20"/>
+              </w:rPr>
+              <w:t xml:space="preserve">{{shipmentLines.lineMode}}</w:t>
             </w:r>
           </w:p>
         </w:tc>

</xml_diff>